<commit_message>
Confirm Control Centre device split and breakpoints (Emmanuel, 3 Sep 2026)
Resolves the two open items from the device-responsiveness audit:
Logistics field roles (Dispatch, Proof of Pickup/Delivery, Trunking)
are phone-first, Agronomist/Admin-Finance office roles stay
tablet/desktop-first, and the 1024px/768px breakpoints are locked in.

Updates the PRD (Section 5.1 table + closing note), the IA doc
(Section 8 item marked RESOLVED, Section 9.1 table), and the Internal
Operations wireframe's rail note to state these as confirmed rather
than open, clearing the path to Stage 4.

Co-Authored-By: Claude Sonnet 5 <noreply@anthropic.com>
</commit_message>
<xml_diff>
--- a/Farm_Master_IA_Stage2.docx
+++ b/Farm_Master_IA_Stage2.docx
@@ -2184,7 +2184,7 @@
         <w:pStyle w:val="ListParagraph"/>
       </w:pPr>
       <w:r>
-        <w:t>Control Centre device priority (added at Stage 3 device-responsiveness audit, 3 September 2026) — office roles (Agronomist, Admin/Finance) are treated as tablet/desktop-first and field roles (Logistics dispatch, proof of pickup/delivery) as provisionally phone-first, since a rider is not carrying a tablet (PRD Section 5.1). Not yet confirmed with Emmanuel.</w:t>
+        <w:t>Control Centre device priority (added at Stage 3 device-responsiveness audit, 3 September 2026) — RESOLVED by Emmanuel, 3 September 2026: office roles (Agronomist, Admin/Finance) are tablet/desktop-first and field roles (Logistics dispatch, proof of pickup/delivery) are phone-first, since a rider is not carrying a tablet (PRD Section 5.1). Breakpoints (1024px / 768px) also confirmed as specified.</w:t>
       </w:r>
     </w:p>
     <w:p>
@@ -2192,7 +2192,7 @@
         <w:spacing w:after="160"/>
       </w:pPr>
       <w:r>
-        <w:t>The first two don’t need resolving before Stage 3 starts. The device-priority question does need resolving before Stage 4 (visual design), since it determines whether the Logistics-facing screens get a phone-first or tablet-first treatment. I’ll proceed to Stage 3 (low-fi wireframes) using what’s marked Phase 1 pilot above, starting with the Buyer Portal or Farmer Portal — your call on which one to wireframe first, per the workflow guide’s “start with whichever portal is most central to your pilot.”</w:t>
+        <w:t>None of the three needs resolving before Stage 3 starts, and as of 3 September 2026 all three are resolved. I’ll proceed to Stage 4 (visual design) using the confirmed device priorities above, starting with the Buyer Portal or Farmer Portal — your call on which one to design first, per the workflow guide’s “start with whichever portal is most central to your pilot.”</w:t>
       </w:r>
     </w:p>
     <w:p>
@@ -2599,7 +2599,7 @@
           </w:tcPr>
           <w:p>
             <w:r>
-              <w:t>Split — OPEN DECISION</w:t>
+              <w:t>Split — CONFIRMED</w:t>
             </w:r>
           </w:p>
         </w:tc>
@@ -2609,7 +2609,7 @@
           </w:tcPr>
           <w:p>
             <w:r>
-              <w:t>Office-role screens (Dashboard, Formula Builder, Finance, Reporting, MoFA, User Admin) are tablet/desktop-first. Field-role screens (Logistics Dispatch, Proof of Pickup/Delivery, Trunking) are provisionally phone-first — confirm before Stage 4.</w:t>
+              <w:t>Office-role screens (Dashboard, Formula Builder, Finance, Reporting, MoFA, User Admin) are tablet/desktop-first. Field-role screens (Logistics Dispatch, Proof of Pickup/Delivery, Trunking) are phone-first — confirmed by Emmanuel, 3 September 2026.</w:t>
             </w:r>
           </w:p>
         </w:tc>

</xml_diff>